<commit_message>
feat: agregar skill save-closure-report como paso obligatorio de cierre de ticket
- Nuevo skill ai-specs/skills/save-closure-report/SKILL.md: genera reporte
  de cierre con estado de cada etapa del flujo (propose, apply, security
  review, verify, QA, archive, sync, commit) y lo postea en ClickUp
- Nuevo comando .claude/commands/save-closure-report.md
- CLAUDE.md: flujo actualizado a 10 pasos, /save-closure-report como
  obligatorio despues de /commit; comandos actualizados a /opsx:propose
- QUICKSTART.md: paso 8 agregado en tabla Parte 2; intro actualizada
- QUICKSTART-SPECBOOT.docx: mismos cambios reflejados en la guia Word
</commit_message>
<xml_diff>
--- a/QUICKSTART-SPECBOOT.docx
+++ b/QUICKSTART-SPECBOOT.docx
@@ -75,7 +75,7 @@
           <w:sz w:val="22"/>
           <w:szCs w:val="22"/>
         </w:rPr>
-        <w:t xml:space="preserve">el flujo termina en un Pull Request (/commit). Mergear ese PR y deployar dependen 100% del CI/CD propio de tu proyecto, no de specboot (ver Parte 3).</w:t>
+        <w:t xml:space="preserve">el flujo termina con el reporte de cierre (`/save-closure-report`). Mergear el PR y deployar dependen 100% del CI/CD propio de tu proyecto, no de specboot (ver Parte 3).</w:t>
       </w:r>
     </w:p>
     <w:p>
@@ -160,6 +160,81 @@
           <w:szCs w:val="22"/>
         </w:rPr>
         <w:t xml:space="preserve">Usalo cuando el repositorio de NUKARSOFT-SpecBoot recibio mejoras (nuevos skills, correcciones, nuevos comandos) y queres traerlos a un proyecto donde ya tenes specboot instalado, sin perder lo que ya personalizaste (docs/, openspec/, tu codigo).</w:t>
+      </w:r>
+    </w:p>
+    <w:p>
+      <w:pPr>
+        <w:pStyle w:val="Heading3"/>
+        <w:spacing w:after="120" w:before="240"/>
+      </w:pPr>
+      <w:r>
+        <w:rPr>
+          <w:rFonts w:ascii="Arial" w:cs="Arial" w:eastAsia="Arial" w:hAnsi="Arial"/>
+          <w:b/>
+          <w:bCs/>
+          <w:color w:val="2E75B6"/>
+          <w:sz w:val="24"/>
+          <w:szCs w:val="24"/>
+        </w:rPr>
+        <w:t xml:space="preserve">Paso 0 — Actualizar OpenSpec (npm)</w:t>
+      </w:r>
+    </w:p>
+    <w:p>
+      <w:pPr>
+        <w:spacing w:after="120" w:before="60"/>
+      </w:pPr>
+      <w:r>
+        <w:rPr>
+          <w:rFonts w:ascii="Arial" w:cs="Arial" w:eastAsia="Arial" w:hAnsi="Arial"/>
+          <w:sz w:val="22"/>
+          <w:szCs w:val="22"/>
+        </w:rPr>
+        <w:t xml:space="preserve">Abri CMD y ejecuta este comando para actualizar el paquete npm de OpenSpec antes de sincronizar SpecBoot:</w:t>
+      </w:r>
+    </w:p>
+    <w:p>
+      <w:pPr>
+        <w:shd w:fill="F2F2F2" w:val="clear"/>
+        <w:spacing w:after="0" w:before="0"/>
+        <w:ind w:left="360"/>
+      </w:pPr>
+      <w:r>
+        <w:rPr>
+          <w:rFonts w:ascii="Courier New" w:cs="Courier New" w:eastAsia="Courier New" w:hAnsi="Courier New"/>
+          <w:color w:val="1F3864"/>
+          <w:sz w:val="18"/>
+          <w:szCs w:val="18"/>
+        </w:rPr>
+        <w:t xml:space="preserve">npm install -g @fission-ai/openspec@latest</w:t>
+      </w:r>
+    </w:p>
+    <w:p>
+      <w:pPr>
+        <w:spacing w:after="60" w:before="40"/>
+      </w:pPr>
+      <w:r>
+        <w:rPr>
+          <w:rFonts w:ascii="Arial" w:cs="Arial" w:eastAsia="Arial" w:hAnsi="Arial"/>
+          <w:sz w:val="22"/>
+          <w:szCs w:val="22"/>
+        </w:rPr>
+        <w:t xml:space="preserve">Luego regenerá los comandos dentro de tu proyecto y reiniciá Claude Code:</w:t>
+      </w:r>
+    </w:p>
+    <w:p>
+      <w:pPr>
+        <w:shd w:fill="F2F2F2" w:val="clear"/>
+        <w:spacing w:after="0" w:before="0"/>
+        <w:ind w:left="360"/>
+      </w:pPr>
+      <w:r>
+        <w:rPr>
+          <w:rFonts w:ascii="Courier New" w:cs="Courier New" w:eastAsia="Courier New" w:hAnsi="Courier New"/>
+          <w:color w:val="1F3864"/>
+          <w:sz w:val="18"/>
+          <w:szCs w:val="18"/>
+        </w:rPr>
+        <w:t xml:space="preserve">cd C:\ruta\a\tu-proyecto &amp;&amp; openspec init --force</w:t>
       </w:r>
     </w:p>
     <w:p>
@@ -943,15 +1018,7 @@
                 <w:sz w:val="22"/>
                 <w:szCs w:val="22"/>
               </w:rPr>
-              <w:t xml:space="preserve"> cd C:\ruta\tu-proyecto</w:t>
-            </w:r>
-            <w:r>
-              <w:rPr>
-                <w:rFonts w:ascii="Arial" w:cs="Arial" w:eastAsia="Arial" w:hAnsi="Arial"/>
-                <w:sz w:val="22"/>
-                <w:szCs w:val="22"/>
-              </w:rPr>
-              <w:t xml:space="preserve"> → openspec init</w:t>
+              <w:t xml:space="preserve"> cd C:\ruta\tu-proyecto → openspec init</w:t>
             </w:r>
           </w:p>
         </w:tc>
@@ -978,7 +1045,7 @@
                 <w:sz w:val="22"/>
                 <w:szCs w:val="22"/>
               </w:rPr>
-              <w:t xml:space="preserve">Crea openspec/ (config.yaml, changes/, specs/) y habilita /new, /ff, /apply, /verify, /archive. Tambien crea .claude/ con comandos base.</w:t>
+              <w:t xml:space="preserve">Crea openspec/ (config.yaml, changes/, specs/) y los comandos /opsx:apply, /opsx:archive, /opsx:propose (entre otros). Nota: /new y /ff no están en el perfil por defecto; usar /opsx:propose que equivale a ambos. También crea .claude/ con comandos base.</w:t>
             </w:r>
           </w:p>
         </w:tc>
@@ -2674,7 +2741,7 @@
                 <w:sz w:val="19"/>
                 <w:szCs w:val="19"/>
               </w:rPr>
-              <w:t xml:space="preserve">✅ Claude te guia al siguiente paso: "/new &lt;TICKET-ID&gt;"</w:t>
+              <w:t xml:space="preserve">✅ Claude te guia al siguiente paso: "/opsx:propose &lt;TICKET-ID&gt;"</w:t>
             </w:r>
           </w:p>
         </w:tc>
@@ -2736,7 +2803,7 @@
                 <w:sz w:val="20"/>
                 <w:szCs w:val="20"/>
               </w:rPr>
-              <w:t xml:space="preserve">/new &lt;TICKET-ID&gt;</w:t>
+              <w:t xml:space="preserve">/opsx:propose &lt;TICKET-ID&gt;</w:t>
             </w:r>
           </w:p>
           <w:p>
@@ -2751,9 +2818,151 @@
                 <w:sz w:val="18"/>
                 <w:szCs w:val="18"/>
               </w:rPr>
-              <w:t xml:space="preserve">luego</w:t>
-            </w:r>
-          </w:p>
+              <w:t xml:space="preserve">(equivale a /new + /ff en un solo paso. Los comandos /new y /ff individuales no están disponibles en el perfil por defecto de OpenSpec.)</w:t>
+            </w:r>
+          </w:p>
+        </w:tc>
+        <w:tc>
+          <w:tcPr>
+            <w:tcW w:type="dxa" w:w="3126"/>
+            <w:tcBorders>
+              <w:top w:val="single" w:color="CCCCCC" w:sz="1"/>
+              <w:left w:val="single" w:color="CCCCCC" w:sz="1"/>
+              <w:bottom w:val="single" w:color="CCCCCC" w:sz="1"/>
+              <w:right w:val="single" w:color="CCCCCC" w:sz="1"/>
+            </w:tcBorders>
+            <w:tcMar>
+              <w:top w:type="dxa" w:w="80"/>
+              <w:left w:type="dxa" w:w="120"/>
+              <w:bottom w:type="dxa" w:w="80"/>
+              <w:right w:type="dxa" w:w="120"/>
+            </w:tcMar>
+          </w:tcPr>
+          <w:p>
+            <w:r>
+              <w:rPr>
+                <w:rFonts w:ascii="Arial" w:cs="Arial" w:eastAsia="Arial" w:hAnsi="Arial"/>
+                <w:sz w:val="22"/>
+                <w:szCs w:val="22"/>
+              </w:rPr>
+              <w:t xml:space="preserve">Crea el change de OpenSpec: propuesta, diseno, tareas y specs delta.</w:t>
+            </w:r>
+          </w:p>
+        </w:tc>
+        <w:tc>
+          <w:tcPr>
+            <w:tcW w:type="dxa" w:w="3500"/>
+            <w:tcBorders>
+              <w:top w:val="single" w:color="CCCCCC" w:sz="1"/>
+              <w:left w:val="single" w:color="CCCCCC" w:sz="1"/>
+              <w:bottom w:val="single" w:color="CCCCCC" w:sz="1"/>
+              <w:right w:val="single" w:color="CCCCCC" w:sz="1"/>
+            </w:tcBorders>
+            <w:tcMar>
+              <w:top w:type="dxa" w:w="80"/>
+              <w:left w:type="dxa" w:w="120"/>
+              <w:bottom w:type="dxa" w:w="80"/>
+              <w:right w:type="dxa" w:w="120"/>
+            </w:tcMar>
+          </w:tcPr>
+          <w:p>
+            <w:r>
+              <w:rPr>
+                <w:rFonts w:ascii="Arial" w:cs="Arial" w:eastAsia="Arial" w:hAnsi="Arial"/>
+                <w:b/>
+                <w:bCs/>
+                <w:sz w:val="20"/>
+                <w:szCs w:val="20"/>
+              </w:rPr>
+              <w:t xml:space="preserve">📁 Repo:</w:t>
+            </w:r>
+          </w:p>
+          <w:p>
+            <w:r>
+              <w:rPr>
+                <w:rFonts w:ascii="Courier New" w:cs="Courier New" w:eastAsia="Courier New" w:hAnsi="Courier New"/>
+                <w:sz w:val="19"/>
+                <w:szCs w:val="19"/>
+              </w:rPr>
+              <w:t xml:space="preserve">openspec/changes/&lt;TICKET-ID&gt;/proposal.md</w:t>
+            </w:r>
+          </w:p>
+          <w:p>
+            <w:r>
+              <w:rPr>
+                <w:rFonts w:ascii="Courier New" w:cs="Courier New" w:eastAsia="Courier New" w:hAnsi="Courier New"/>
+                <w:sz w:val="19"/>
+                <w:szCs w:val="19"/>
+              </w:rPr>
+              <w:t xml:space="preserve">openspec/changes/&lt;TICKET-ID&gt;/design.md</w:t>
+            </w:r>
+          </w:p>
+          <w:p>
+            <w:r>
+              <w:rPr>
+                <w:rFonts w:ascii="Courier New" w:cs="Courier New" w:eastAsia="Courier New" w:hAnsi="Courier New"/>
+                <w:sz w:val="19"/>
+                <w:szCs w:val="19"/>
+              </w:rPr>
+              <w:t xml:space="preserve">openspec/changes/&lt;TICKET-ID&gt;/tasks.md</w:t>
+            </w:r>
+          </w:p>
+          <w:p>
+            <w:r>
+              <w:rPr>
+                <w:rFonts w:ascii="Courier New" w:cs="Courier New" w:eastAsia="Courier New" w:hAnsi="Courier New"/>
+                <w:sz w:val="19"/>
+                <w:szCs w:val="19"/>
+              </w:rPr>
+              <w:t xml:space="preserve">openspec/changes/&lt;TICKET-ID&gt;/specs/&lt;cap&gt;/spec.md</w:t>
+            </w:r>
+          </w:p>
+        </w:tc>
+      </w:tr>
+      <w:tr>
+        <w:tc>
+          <w:tcPr>
+            <w:tcW w:type="dxa" w:w="400"/>
+            <w:tcBorders>
+              <w:top w:val="single" w:color="CCCCCC" w:sz="1"/>
+              <w:left w:val="single" w:color="CCCCCC" w:sz="1"/>
+              <w:bottom w:val="single" w:color="CCCCCC" w:sz="1"/>
+              <w:right w:val="single" w:color="CCCCCC" w:sz="1"/>
+            </w:tcBorders>
+            <w:tcMar>
+              <w:top w:type="dxa" w:w="80"/>
+              <w:left w:type="dxa" w:w="120"/>
+              <w:bottom w:type="dxa" w:w="80"/>
+              <w:right w:type="dxa" w:w="120"/>
+            </w:tcMar>
+          </w:tcPr>
+          <w:p>
+            <w:r>
+              <w:rPr>
+                <w:rFonts w:ascii="Arial" w:cs="Arial" w:eastAsia="Arial" w:hAnsi="Arial"/>
+                <w:sz w:val="22"/>
+                <w:szCs w:val="22"/>
+              </w:rPr>
+              <w:t xml:space="preserve">3</w:t>
+            </w:r>
+          </w:p>
+        </w:tc>
+        <w:tc>
+          <w:tcPr>
+            <w:tcW w:type="dxa" w:w="2000"/>
+            <w:tcBorders>
+              <w:top w:val="single" w:color="CCCCCC" w:sz="1"/>
+              <w:left w:val="single" w:color="CCCCCC" w:sz="1"/>
+              <w:bottom w:val="single" w:color="CCCCCC" w:sz="1"/>
+              <w:right w:val="single" w:color="CCCCCC" w:sz="1"/>
+            </w:tcBorders>
+            <w:tcMar>
+              <w:top w:type="dxa" w:w="80"/>
+              <w:left w:type="dxa" w:w="120"/>
+              <w:bottom w:type="dxa" w:w="80"/>
+              <w:right w:type="dxa" w:w="120"/>
+            </w:tcMar>
+          </w:tcPr>
           <w:p>
             <w:pPr>
               <w:spacing w:after="20" w:before="20"/>
@@ -2767,22 +2976,7 @@
                 <w:sz w:val="20"/>
                 <w:szCs w:val="20"/>
               </w:rPr>
-              <w:t xml:space="preserve">/ff &lt;TICKET-ID&gt;</w:t>
-            </w:r>
-          </w:p>
-          <w:p>
-            <w:pPr>
-              <w:spacing w:after="20" w:before="20"/>
-            </w:pPr>
-            <w:r>
-              <w:rPr>
-                <w:rFonts w:ascii="Arial" w:cs="Arial" w:eastAsia="Arial" w:hAnsi="Arial"/>
-                <w:i/>
-                <w:iCs/>
-                <w:sz w:val="18"/>
-                <w:szCs w:val="18"/>
-              </w:rPr>
-              <w:t xml:space="preserve">(o /propose, equivalente a ambos)</w:t>
+              <w:t xml:space="preserve">/apply &lt;TICKET-ID&gt;</w:t>
             </w:r>
           </w:p>
         </w:tc>
@@ -2809,7 +3003,7 @@
                 <w:sz w:val="22"/>
                 <w:szCs w:val="22"/>
               </w:rPr>
-              <w:t xml:space="preserve">Crea el change de OpenSpec: propuesta, diseno, tareas y specs delta.</w:t>
+              <w:t xml:space="preserve">Implementa las tareas de tasks.md una por una: codigo + tests.</w:t>
             </w:r>
           </w:p>
         </w:tc>
@@ -2833,12 +3027,10 @@
             <w:r>
               <w:rPr>
                 <w:rFonts w:ascii="Arial" w:cs="Arial" w:eastAsia="Arial" w:hAnsi="Arial"/>
-                <w:b/>
-                <w:bCs/>
                 <w:sz w:val="20"/>
                 <w:szCs w:val="20"/>
               </w:rPr>
-              <w:t xml:space="preserve">📁 Repo:</w:t>
+              <w:t xml:space="preserve">📁 Repo: Codigo y tests, tasks.md completado</w:t>
             </w:r>
           </w:p>
           <w:p>
@@ -2848,7 +3040,7 @@
                 <w:sz w:val="19"/>
                 <w:szCs w:val="19"/>
               </w:rPr>
-              <w:t xml:space="preserve">openspec/changes/&lt;TICKET-ID&gt;/proposal.md</w:t>
+              <w:t xml:space="preserve">YYYY-MM-DD-step-N-unit-test-and-db-verification.md</w:t>
             </w:r>
           </w:p>
           <w:p>
@@ -2858,27 +3050,7 @@
                 <w:sz w:val="19"/>
                 <w:szCs w:val="19"/>
               </w:rPr>
-              <w:t xml:space="preserve">openspec/changes/&lt;TICKET-ID&gt;/design.md</w:t>
-            </w:r>
-          </w:p>
-          <w:p>
-            <w:r>
-              <w:rPr>
-                <w:rFonts w:ascii="Courier New" w:cs="Courier New" w:eastAsia="Courier New" w:hAnsi="Courier New"/>
-                <w:sz w:val="19"/>
-                <w:szCs w:val="19"/>
-              </w:rPr>
-              <w:t xml:space="preserve">openspec/changes/&lt;TICKET-ID&gt;/tasks.md</w:t>
-            </w:r>
-          </w:p>
-          <w:p>
-            <w:r>
-              <w:rPr>
-                <w:rFonts w:ascii="Courier New" w:cs="Courier New" w:eastAsia="Courier New" w:hAnsi="Courier New"/>
-                <w:sz w:val="19"/>
-                <w:szCs w:val="19"/>
-              </w:rPr>
-              <w:t xml:space="preserve">openspec/changes/&lt;TICKET-ID&gt;/specs/&lt;cap&gt;/spec.md</w:t>
+              <w:t xml:space="preserve">coverage/YYYYMMDD-backend-coverage.md</w:t>
             </w:r>
           </w:p>
         </w:tc>
@@ -2904,10 +3076,13 @@
             <w:r>
               <w:rPr>
                 <w:rFonts w:ascii="Arial" w:cs="Arial" w:eastAsia="Arial" w:hAnsi="Arial"/>
-                <w:sz w:val="22"/>
-                <w:szCs w:val="22"/>
-              </w:rPr>
-              <w:t xml:space="preserve">3</w:t>
+                <w:b/>
+                <w:bCs/>
+                <w:color w:val="C55A11"/>
+                <w:sz w:val="22"/>
+                <w:szCs w:val="22"/>
+              </w:rPr>
+              <w:t xml:space="preserve">3b</w:t>
             </w:r>
           </w:p>
         </w:tc>
@@ -2940,7 +3115,22 @@
                 <w:sz w:val="20"/>
                 <w:szCs w:val="20"/>
               </w:rPr>
-              <w:t xml:space="preserve">/apply &lt;TICKET-ID&gt;</w:t>
+              <w:t xml:space="preserve">/security-review &lt;TICKET-ID&gt;</w:t>
+            </w:r>
+          </w:p>
+          <w:p>
+            <w:pPr>
+              <w:spacing w:after="20" w:before="20"/>
+            </w:pPr>
+            <w:r>
+              <w:rPr>
+                <w:rFonts w:ascii="Arial" w:cs="Arial" w:eastAsia="Arial" w:hAnsi="Arial"/>
+                <w:i/>
+                <w:iCs/>
+                <w:sz w:val="18"/>
+                <w:szCs w:val="18"/>
+              </w:rPr>
+              <w:t xml:space="preserve">(auto al finalizar /apply)</w:t>
             </w:r>
           </w:p>
         </w:tc>
@@ -2967,7 +3157,7 @@
                 <w:sz w:val="22"/>
                 <w:szCs w:val="22"/>
               </w:rPr>
-              <w:t xml:space="preserve">Implementa las tareas de tasks.md una por una: codigo + tests.</w:t>
+              <w:t xml:space="preserve">Revision de seguridad OWASP Top 10 + buenas practicas Nukarsoft sobre el diff del ticket. Hallazgos Criticos o Altos BLOQUEAN el flujo.</w:t>
             </w:r>
           </w:p>
         </w:tc>
@@ -2994,27 +3184,17 @@
                 <w:sz w:val="20"/>
                 <w:szCs w:val="20"/>
               </w:rPr>
-              <w:t xml:space="preserve">📁 Repo: Codigo y tests, tasks.md completado</w:t>
-            </w:r>
-          </w:p>
-          <w:p>
-            <w:r>
-              <w:rPr>
-                <w:rFonts w:ascii="Courier New" w:cs="Courier New" w:eastAsia="Courier New" w:hAnsi="Courier New"/>
-                <w:sz w:val="19"/>
-                <w:szCs w:val="19"/>
-              </w:rPr>
-              <w:t xml:space="preserve">YYYY-MM-DD-step-N-unit-test-and-db-verification.md</w:t>
-            </w:r>
-          </w:p>
-          <w:p>
-            <w:r>
-              <w:rPr>
-                <w:rFonts w:ascii="Courier New" w:cs="Courier New" w:eastAsia="Courier New" w:hAnsi="Courier New"/>
-                <w:sz w:val="19"/>
-                <w:szCs w:val="19"/>
-              </w:rPr>
-              <w:t xml:space="preserve">coverage/YYYYMMDD-backend-coverage.md</w:t>
+              <w:t xml:space="preserve">📁 Repo: YYYY-MM-DD-security-review-&lt;TICKET-ID&gt;.docx</w:t>
+            </w:r>
+          </w:p>
+          <w:p>
+            <w:r>
+              <w:rPr>
+                <w:rFonts w:ascii="Arial" w:cs="Arial" w:eastAsia="Arial" w:hAnsi="Arial"/>
+                <w:sz w:val="20"/>
+                <w:szCs w:val="20"/>
+              </w:rPr>
+              <w:t xml:space="preserve">🔗 ClickUp: archivo adjunto + documento creado</w:t>
             </w:r>
           </w:p>
         </w:tc>
@@ -3040,13 +3220,10 @@
             <w:r>
               <w:rPr>
                 <w:rFonts w:ascii="Arial" w:cs="Arial" w:eastAsia="Arial" w:hAnsi="Arial"/>
-                <w:b/>
-                <w:bCs/>
-                <w:color w:val="C55A11"/>
-                <w:sz w:val="22"/>
-                <w:szCs w:val="22"/>
-              </w:rPr>
-              <w:t xml:space="preserve">3b</w:t>
+                <w:sz w:val="22"/>
+                <w:szCs w:val="22"/>
+              </w:rPr>
+              <w:t xml:space="preserve">4</w:t>
             </w:r>
           </w:p>
         </w:tc>
@@ -3079,7 +3256,7 @@
                 <w:sz w:val="20"/>
                 <w:szCs w:val="20"/>
               </w:rPr>
-              <w:t xml:space="preserve">/security-review &lt;TICKET-ID&gt;</w:t>
+              <w:t xml:space="preserve">/verify &lt;TICKET-ID&gt;</w:t>
             </w:r>
           </w:p>
           <w:p>
@@ -3089,124 +3266,12 @@
             <w:r>
               <w:rPr>
                 <w:rFonts w:ascii="Arial" w:cs="Arial" w:eastAsia="Arial" w:hAnsi="Arial"/>
-                <w:i/>
-                <w:iCs/>
                 <w:sz w:val="18"/>
                 <w:szCs w:val="18"/>
               </w:rPr>
-              <w:t xml:space="preserve">(auto al finalizar /apply)</w:t>
-            </w:r>
-          </w:p>
-        </w:tc>
-        <w:tc>
-          <w:tcPr>
-            <w:tcW w:type="dxa" w:w="3126"/>
-            <w:tcBorders>
-              <w:top w:val="single" w:color="CCCCCC" w:sz="1"/>
-              <w:left w:val="single" w:color="CCCCCC" w:sz="1"/>
-              <w:bottom w:val="single" w:color="CCCCCC" w:sz="1"/>
-              <w:right w:val="single" w:color="CCCCCC" w:sz="1"/>
-            </w:tcBorders>
-            <w:tcMar>
-              <w:top w:type="dxa" w:w="80"/>
-              <w:left w:type="dxa" w:w="120"/>
-              <w:bottom w:type="dxa" w:w="80"/>
-              <w:right w:type="dxa" w:w="120"/>
-            </w:tcMar>
-          </w:tcPr>
-          <w:p>
-            <w:r>
-              <w:rPr>
-                <w:rFonts w:ascii="Arial" w:cs="Arial" w:eastAsia="Arial" w:hAnsi="Arial"/>
-                <w:sz w:val="22"/>
-                <w:szCs w:val="22"/>
-              </w:rPr>
-              <w:t xml:space="preserve">Revision de seguridad OWASP Top 10 + buenas practicas Nukarsoft sobre el diff del ticket. Hallazgos Criticos o Altos BLOQUEAN el flujo.</w:t>
-            </w:r>
-          </w:p>
-        </w:tc>
-        <w:tc>
-          <w:tcPr>
-            <w:tcW w:type="dxa" w:w="3500"/>
-            <w:tcBorders>
-              <w:top w:val="single" w:color="CCCCCC" w:sz="1"/>
-              <w:left w:val="single" w:color="CCCCCC" w:sz="1"/>
-              <w:bottom w:val="single" w:color="CCCCCC" w:sz="1"/>
-              <w:right w:val="single" w:color="CCCCCC" w:sz="1"/>
-            </w:tcBorders>
-            <w:tcMar>
-              <w:top w:type="dxa" w:w="80"/>
-              <w:left w:type="dxa" w:w="120"/>
-              <w:bottom w:type="dxa" w:w="80"/>
-              <w:right w:type="dxa" w:w="120"/>
-            </w:tcMar>
-          </w:tcPr>
-          <w:p>
-            <w:r>
-              <w:rPr>
-                <w:rFonts w:ascii="Arial" w:cs="Arial" w:eastAsia="Arial" w:hAnsi="Arial"/>
-                <w:sz w:val="20"/>
-                <w:szCs w:val="20"/>
-              </w:rPr>
-              <w:t xml:space="preserve">📁 Repo: YYYY-MM-DD-security-review-&lt;TICKET-ID&gt;.docx</w:t>
-            </w:r>
-          </w:p>
-          <w:p>
-            <w:r>
-              <w:rPr>
-                <w:rFonts w:ascii="Arial" w:cs="Arial" w:eastAsia="Arial" w:hAnsi="Arial"/>
-                <w:sz w:val="20"/>
-                <w:szCs w:val="20"/>
-              </w:rPr>
-              <w:t xml:space="preserve">🔗 ClickUp: archivo adjunto + documento creado</w:t>
-            </w:r>
-          </w:p>
-        </w:tc>
-      </w:tr>
-      <w:tr>
-        <w:tc>
-          <w:tcPr>
-            <w:tcW w:type="dxa" w:w="400"/>
-            <w:tcBorders>
-              <w:top w:val="single" w:color="CCCCCC" w:sz="1"/>
-              <w:left w:val="single" w:color="CCCCCC" w:sz="1"/>
-              <w:bottom w:val="single" w:color="CCCCCC" w:sz="1"/>
-              <w:right w:val="single" w:color="CCCCCC" w:sz="1"/>
-            </w:tcBorders>
-            <w:tcMar>
-              <w:top w:type="dxa" w:w="80"/>
-              <w:left w:type="dxa" w:w="120"/>
-              <w:bottom w:type="dxa" w:w="80"/>
-              <w:right w:type="dxa" w:w="120"/>
-            </w:tcMar>
-          </w:tcPr>
-          <w:p>
-            <w:r>
-              <w:rPr>
-                <w:rFonts w:ascii="Arial" w:cs="Arial" w:eastAsia="Arial" w:hAnsi="Arial"/>
-                <w:sz w:val="22"/>
-                <w:szCs w:val="22"/>
-              </w:rPr>
-              <w:t xml:space="preserve">4</w:t>
-            </w:r>
-          </w:p>
-        </w:tc>
-        <w:tc>
-          <w:tcPr>
-            <w:tcW w:type="dxa" w:w="2000"/>
-            <w:tcBorders>
-              <w:top w:val="single" w:color="CCCCCC" w:sz="1"/>
-              <w:left w:val="single" w:color="CCCCCC" w:sz="1"/>
-              <w:bottom w:val="single" w:color="CCCCCC" w:sz="1"/>
-              <w:right w:val="single" w:color="CCCCCC" w:sz="1"/>
-            </w:tcBorders>
-            <w:tcMar>
-              <w:top w:type="dxa" w:w="80"/>
-              <w:left w:type="dxa" w:w="120"/>
-              <w:bottom w:type="dxa" w:w="80"/>
-              <w:right w:type="dxa" w:w="120"/>
-            </w:tcMar>
-          </w:tcPr>
+              <w:t xml:space="preserve">+</w:t>
+            </w:r>
+          </w:p>
           <w:p>
             <w:pPr>
               <w:spacing w:after="20" w:before="20"/>
@@ -3220,22 +3285,119 @@
                 <w:sz w:val="20"/>
                 <w:szCs w:val="20"/>
               </w:rPr>
-              <w:t xml:space="preserve">/verify &lt;TICKET-ID&gt;</w:t>
-            </w:r>
-          </w:p>
-          <w:p>
-            <w:pPr>
-              <w:spacing w:after="20" w:before="20"/>
-            </w:pPr>
-            <w:r>
-              <w:rPr>
-                <w:rFonts w:ascii="Arial" w:cs="Arial" w:eastAsia="Arial" w:hAnsi="Arial"/>
-                <w:sz w:val="18"/>
-                <w:szCs w:val="18"/>
-              </w:rPr>
-              <w:t xml:space="preserve">+</w:t>
-            </w:r>
-          </w:p>
+              <w:t xml:space="preserve">/save-verify-report &lt;TICKET-ID&gt;</w:t>
+            </w:r>
+          </w:p>
+        </w:tc>
+        <w:tc>
+          <w:tcPr>
+            <w:tcW w:type="dxa" w:w="3126"/>
+            <w:tcBorders>
+              <w:top w:val="single" w:color="CCCCCC" w:sz="1"/>
+              <w:left w:val="single" w:color="CCCCCC" w:sz="1"/>
+              <w:bottom w:val="single" w:color="CCCCCC" w:sz="1"/>
+              <w:right w:val="single" w:color="CCCCCC" w:sz="1"/>
+            </w:tcBorders>
+            <w:tcMar>
+              <w:top w:type="dxa" w:w="80"/>
+              <w:left w:type="dxa" w:w="120"/>
+              <w:bottom w:type="dxa" w:w="80"/>
+              <w:right w:type="dxa" w:w="120"/>
+            </w:tcMar>
+          </w:tcPr>
+          <w:p>
+            <w:r>
+              <w:rPr>
+                <w:rFonts w:ascii="Arial" w:cs="Arial" w:eastAsia="Arial" w:hAnsi="Arial"/>
+                <w:sz w:val="22"/>
+                <w:szCs w:val="22"/>
+              </w:rPr>
+              <w:t xml:space="preserve">Valida la implementacion contra los artefactos del change. save-verify-report persiste el resultado (verify solo muestra en chat).</w:t>
+            </w:r>
+          </w:p>
+        </w:tc>
+        <w:tc>
+          <w:tcPr>
+            <w:tcW w:type="dxa" w:w="3500"/>
+            <w:tcBorders>
+              <w:top w:val="single" w:color="CCCCCC" w:sz="1"/>
+              <w:left w:val="single" w:color="CCCCCC" w:sz="1"/>
+              <w:bottom w:val="single" w:color="CCCCCC" w:sz="1"/>
+              <w:right w:val="single" w:color="CCCCCC" w:sz="1"/>
+            </w:tcBorders>
+            <w:tcMar>
+              <w:top w:type="dxa" w:w="80"/>
+              <w:left w:type="dxa" w:w="120"/>
+              <w:bottom w:type="dxa" w:w="80"/>
+              <w:right w:type="dxa" w:w="120"/>
+            </w:tcMar>
+          </w:tcPr>
+          <w:p>
+            <w:r>
+              <w:rPr>
+                <w:rFonts w:ascii="Arial" w:cs="Arial" w:eastAsia="Arial" w:hAnsi="Arial"/>
+                <w:sz w:val="20"/>
+                <w:szCs w:val="20"/>
+              </w:rPr>
+              <w:t xml:space="preserve">📁 Repo: YYYY-MM-DD-verify-report.md</w:t>
+            </w:r>
+          </w:p>
+          <w:p>
+            <w:r>
+              <w:rPr>
+                <w:rFonts w:ascii="Arial" w:cs="Arial" w:eastAsia="Arial" w:hAnsi="Arial"/>
+                <w:sz w:val="20"/>
+                <w:szCs w:val="20"/>
+              </w:rPr>
+              <w:t xml:space="preserve">🔗 ClickUp: comentario con veredicto (PASS / FAIL / PARTIAL)</w:t>
+            </w:r>
+          </w:p>
+        </w:tc>
+      </w:tr>
+      <w:tr>
+        <w:tc>
+          <w:tcPr>
+            <w:tcW w:type="dxa" w:w="400"/>
+            <w:tcBorders>
+              <w:top w:val="single" w:color="CCCCCC" w:sz="1"/>
+              <w:left w:val="single" w:color="CCCCCC" w:sz="1"/>
+              <w:bottom w:val="single" w:color="CCCCCC" w:sz="1"/>
+              <w:right w:val="single" w:color="CCCCCC" w:sz="1"/>
+            </w:tcBorders>
+            <w:tcMar>
+              <w:top w:type="dxa" w:w="80"/>
+              <w:left w:type="dxa" w:w="120"/>
+              <w:bottom w:type="dxa" w:w="80"/>
+              <w:right w:type="dxa" w:w="120"/>
+            </w:tcMar>
+          </w:tcPr>
+          <w:p>
+            <w:r>
+              <w:rPr>
+                <w:rFonts w:ascii="Arial" w:cs="Arial" w:eastAsia="Arial" w:hAnsi="Arial"/>
+                <w:sz w:val="22"/>
+                <w:szCs w:val="22"/>
+              </w:rPr>
+              <w:t xml:space="preserve">5</w:t>
+            </w:r>
+          </w:p>
+        </w:tc>
+        <w:tc>
+          <w:tcPr>
+            <w:tcW w:type="dxa" w:w="2000"/>
+            <w:tcBorders>
+              <w:top w:val="single" w:color="CCCCCC" w:sz="1"/>
+              <w:left w:val="single" w:color="CCCCCC" w:sz="1"/>
+              <w:bottom w:val="single" w:color="CCCCCC" w:sz="1"/>
+              <w:right w:val="single" w:color="CCCCCC" w:sz="1"/>
+            </w:tcBorders>
+            <w:tcMar>
+              <w:top w:type="dxa" w:w="80"/>
+              <w:left w:type="dxa" w:w="120"/>
+              <w:bottom w:type="dxa" w:w="80"/>
+              <w:right w:type="dxa" w:w="120"/>
+            </w:tcMar>
+          </w:tcPr>
           <w:p>
             <w:pPr>
               <w:spacing w:after="20" w:before="20"/>
@@ -3249,7 +3411,7 @@
                 <w:sz w:val="20"/>
                 <w:szCs w:val="20"/>
               </w:rPr>
-              <w:t xml:space="preserve">/save-verify-report &lt;TICKET-ID&gt;</w:t>
+              <w:t xml:space="preserve">/adversarial-review &lt;TICKET-ID&gt;</w:t>
             </w:r>
           </w:p>
         </w:tc>
@@ -3276,7 +3438,7 @@
                 <w:sz w:val="22"/>
                 <w:szCs w:val="22"/>
               </w:rPr>
-              <w:t xml:space="preserve">Valida la implementacion contra los artefactos del change. save-verify-report persiste el resultado (verify solo muestra en chat).</w:t>
+              <w:t xml:space="preserve">Revision red-team: tabla de hallazgos + veredicto PASS/FAIL. Para testing manual: graba con Loom (loom.com, gratis) y pega el link en ClickUp.</w:t>
             </w:r>
           </w:p>
         </w:tc>
@@ -3303,7 +3465,7 @@
                 <w:sz w:val="20"/>
                 <w:szCs w:val="20"/>
               </w:rPr>
-              <w:t xml:space="preserve">📁 Repo: YYYY-MM-DD-verify-report.md</w:t>
+              <w:t xml:space="preserve">📁 Repo: YYYY-MM-DD-adversarial-review.md</w:t>
             </w:r>
           </w:p>
           <w:p>
@@ -3313,7 +3475,7 @@
                 <w:sz w:val="20"/>
                 <w:szCs w:val="20"/>
               </w:rPr>
-              <w:t xml:space="preserve">🔗 ClickUp: comentario con veredicto (PASS / FAIL / PARTIAL)</w:t>
+              <w:t xml:space="preserve">🔗 ClickUp: comentario con veredicto + link Loom</w:t>
             </w:r>
           </w:p>
         </w:tc>
@@ -3339,10 +3501,13 @@
             <w:r>
               <w:rPr>
                 <w:rFonts w:ascii="Arial" w:cs="Arial" w:eastAsia="Arial" w:hAnsi="Arial"/>
-                <w:sz w:val="22"/>
-                <w:szCs w:val="22"/>
-              </w:rPr>
-              <w:t xml:space="preserve">5</w:t>
+                <w:b/>
+                <w:bCs/>
+                <w:color w:val="C55A11"/>
+                <w:sz w:val="22"/>
+                <w:szCs w:val="22"/>
+              </w:rPr>
+              <w:t xml:space="preserve">5b</w:t>
             </w:r>
           </w:p>
         </w:tc>
@@ -3375,7 +3540,7 @@
                 <w:sz w:val="20"/>
                 <w:szCs w:val="20"/>
               </w:rPr>
-              <w:t xml:space="preserve">/adversarial-review &lt;TICKET-ID&gt;</w:t>
+              <w:t xml:space="preserve">/save-qa-report &lt;TICKET-ID&gt;</w:t>
             </w:r>
           </w:p>
         </w:tc>
@@ -3402,7 +3567,7 @@
                 <w:sz w:val="22"/>
                 <w:szCs w:val="22"/>
               </w:rPr>
-              <w:t xml:space="preserve">Revision red-team: tabla de hallazgos + veredicto PASS/FAIL. Para testing manual: graba con Loom (loom.com, gratis) y pega el link en ClickUp.</w:t>
+              <w:t xml:space="preserve">Documenta el testing funcional/manual: tabla de casos de prueba vs. criterios de aceptacion, resultado (PASS/FAIL/PARCIAL), links a grabaciones Loom. Si hay FAILs: NO avanzar hasta resolver.</w:t>
             </w:r>
           </w:p>
         </w:tc>
@@ -3429,7 +3594,7 @@
                 <w:sz w:val="20"/>
                 <w:szCs w:val="20"/>
               </w:rPr>
-              <w:t xml:space="preserve">📁 Repo: YYYY-MM-DD-adversarial-review.md</w:t>
+              <w:t xml:space="preserve">📁 Repo: YYYY-MM-DD-qa-report.md</w:t>
             </w:r>
           </w:p>
           <w:p>
@@ -3439,7 +3604,7 @@
                 <w:sz w:val="20"/>
                 <w:szCs w:val="20"/>
               </w:rPr>
-              <w:t xml:space="preserve">🔗 ClickUp: comentario con veredicto + link Loom</w:t>
+              <w:t xml:space="preserve">🔗 ClickUp: comentario + documento QA creado</w:t>
             </w:r>
           </w:p>
         </w:tc>
@@ -3465,13 +3630,10 @@
             <w:r>
               <w:rPr>
                 <w:rFonts w:ascii="Arial" w:cs="Arial" w:eastAsia="Arial" w:hAnsi="Arial"/>
-                <w:b/>
-                <w:bCs/>
-                <w:color w:val="C55A11"/>
-                <w:sz w:val="22"/>
-                <w:szCs w:val="22"/>
-              </w:rPr>
-              <w:t xml:space="preserve">5b</w:t>
+                <w:sz w:val="22"/>
+                <w:szCs w:val="22"/>
+              </w:rPr>
+              <w:t xml:space="preserve">6</w:t>
             </w:r>
           </w:p>
         </w:tc>
@@ -3504,7 +3666,7 @@
                 <w:sz w:val="20"/>
                 <w:szCs w:val="20"/>
               </w:rPr>
-              <w:t xml:space="preserve">/save-qa-report &lt;TICKET-ID&gt;</w:t>
+              <w:t xml:space="preserve">/archive &lt;TICKET-ID&gt;</w:t>
             </w:r>
           </w:p>
         </w:tc>
@@ -3531,7 +3693,7 @@
                 <w:sz w:val="22"/>
                 <w:szCs w:val="22"/>
               </w:rPr>
-              <w:t xml:space="preserve">Documenta el testing funcional/manual: tabla de casos de prueba vs. criterios de aceptacion, resultado (PASS/FAIL/PARCIAL), links a grabaciones Loom. Si hay FAILs: NO avanzar hasta resolver.</w:t>
+              <w:t xml:space="preserve">Archiva el change y sincroniza los specs principales.</w:t>
             </w:r>
           </w:p>
         </w:tc>
@@ -3558,17 +3720,7 @@
                 <w:sz w:val="20"/>
                 <w:szCs w:val="20"/>
               </w:rPr>
-              <w:t xml:space="preserve">📁 Repo: YYYY-MM-DD-qa-report.md</w:t>
-            </w:r>
-          </w:p>
-          <w:p>
-            <w:r>
-              <w:rPr>
-                <w:rFonts w:ascii="Arial" w:cs="Arial" w:eastAsia="Arial" w:hAnsi="Arial"/>
-                <w:sz w:val="20"/>
-                <w:szCs w:val="20"/>
-              </w:rPr>
-              <w:t xml:space="preserve">🔗 ClickUp: comentario + documento QA creado</w:t>
+              <w:t xml:space="preserve">📁 Repo: openspec/specs/&lt;capability&gt;/spec.md actualizado</w:t>
             </w:r>
           </w:p>
         </w:tc>
@@ -3597,7 +3749,7 @@
                 <w:sz w:val="22"/>
                 <w:szCs w:val="22"/>
               </w:rPr>
-              <w:t xml:space="preserve">6</w:t>
+              <w:t xml:space="preserve">7</w:t>
             </w:r>
           </w:p>
         </w:tc>
@@ -3630,7 +3782,7 @@
                 <w:sz w:val="20"/>
                 <w:szCs w:val="20"/>
               </w:rPr>
-              <w:t xml:space="preserve">/archive &lt;TICKET-ID&gt;</w:t>
+              <w:t xml:space="preserve">/commit</w:t>
             </w:r>
           </w:p>
         </w:tc>
@@ -3657,7 +3809,7 @@
                 <w:sz w:val="22"/>
                 <w:szCs w:val="22"/>
               </w:rPr>
-              <w:t xml:space="preserve">Archiva el change y sincroniza los specs principales.</w:t>
+              <w:t xml:space="preserve">Crea el commit, pushea el branch y abre (o actualiza) el PR con gh. Si hay ticket de ClickUp: actualiza el estado.</w:t>
             </w:r>
           </w:p>
         </w:tc>
@@ -3684,7 +3836,27 @@
                 <w:sz w:val="20"/>
                 <w:szCs w:val="20"/>
               </w:rPr>
-              <w:t xml:space="preserve">📁 Repo: openspec/specs/&lt;capability&gt;/spec.md actualizado</w:t>
+              <w:t xml:space="preserve">📁 Repo: commit en el branch remoto</w:t>
+            </w:r>
+          </w:p>
+          <w:p>
+            <w:r>
+              <w:rPr>
+                <w:rFonts w:ascii="Arial" w:cs="Arial" w:eastAsia="Arial" w:hAnsi="Arial"/>
+                <w:sz w:val="20"/>
+                <w:szCs w:val="20"/>
+              </w:rPr>
+              <w:t xml:space="preserve">🔗 GitHub: PR abierto</w:t>
+            </w:r>
+          </w:p>
+          <w:p>
+            <w:r>
+              <w:rPr>
+                <w:rFonts w:ascii="Arial" w:cs="Arial" w:eastAsia="Arial" w:hAnsi="Arial"/>
+                <w:sz w:val="20"/>
+                <w:szCs w:val="20"/>
+              </w:rPr>
+              <w:t xml:space="preserve">🔗 ClickUp: estado a En progreso + URL del PR</w:t>
             </w:r>
           </w:p>
         </w:tc>
@@ -3692,28 +3864,28 @@
       <w:tr>
         <w:tc>
           <w:tcPr>
-            <w:tcW w:type="dxa" w:w="400"/>
-            <w:tcBorders>
-              <w:top w:val="single" w:color="CCCCCC" w:sz="1"/>
-              <w:left w:val="single" w:color="CCCCCC" w:sz="1"/>
-              <w:bottom w:val="single" w:color="CCCCCC" w:sz="1"/>
-              <w:right w:val="single" w:color="CCCCCC" w:sz="1"/>
-            </w:tcBorders>
-            <w:tcMar>
-              <w:top w:type="dxa" w:w="80"/>
-              <w:left w:type="dxa" w:w="120"/>
-              <w:bottom w:type="dxa" w:w="80"/>
-              <w:right w:type="dxa" w:w="120"/>
-            </w:tcMar>
-          </w:tcPr>
-          <w:p>
-            <w:r>
-              <w:rPr>
-                <w:rFonts w:ascii="Arial" w:cs="Arial" w:eastAsia="Arial" w:hAnsi="Arial"/>
-                <w:sz w:val="22"/>
-                <w:szCs w:val="22"/>
-              </w:rPr>
-              <w:t xml:space="preserve">7</w:t>
+            <w:tcW w:type="dxa" w:w="480"/>
+            <w:tcBorders>
+              <w:top w:val="single" w:color="CCCCCC" w:sz="1"/>
+              <w:left w:val="single" w:color="CCCCCC" w:sz="1"/>
+              <w:bottom w:val="single" w:color="CCCCCC" w:sz="1"/>
+              <w:right w:val="single" w:color="CCCCCC" w:sz="1"/>
+            </w:tcBorders>
+            <w:tcMar>
+              <w:top w:type="dxa" w:w="80"/>
+              <w:left w:type="dxa" w:w="120"/>
+              <w:bottom w:type="dxa" w:w="80"/>
+              <w:right w:type="dxa" w:w="120"/>
+            </w:tcMar>
+          </w:tcPr>
+          <w:p>
+            <w:r>
+              <w:rPr>
+                <w:rFonts w:ascii="Arial" w:cs="Arial" w:eastAsia="Arial" w:hAnsi="Arial"/>
+                <w:sz w:val="22"/>
+                <w:szCs w:val="22"/>
+              </w:rPr>
+              <w:t xml:space="preserve">8</w:t>
             </w:r>
           </w:p>
         </w:tc>
@@ -3746,7 +3918,23 @@
                 <w:sz w:val="20"/>
                 <w:szCs w:val="20"/>
               </w:rPr>
-              <w:t xml:space="preserve">/commit</w:t>
+              <w:t xml:space="preserve">/save-closure-report &lt;TICKET-ID&gt;</w:t>
+            </w:r>
+          </w:p>
+          <w:p>
+            <w:pPr>
+              <w:spacing w:after="20" w:before="20"/>
+            </w:pPr>
+            <w:r>
+              <w:rPr>
+                <w:rFonts w:ascii="Arial" w:cs="Arial" w:eastAsia="Arial" w:hAnsi="Arial"/>
+                <w:i/>
+                <w:iCs/>
+                <w:color w:val="C00000"/>
+                <w:sz w:val="18"/>
+                <w:szCs w:val="18"/>
+              </w:rPr>
+              <w:t xml:space="preserve">⚠️ Obligatorio</w:t>
             </w:r>
           </w:p>
         </w:tc>
@@ -3773,7 +3961,7 @@
                 <w:sz w:val="22"/>
                 <w:szCs w:val="22"/>
               </w:rPr>
-              <w:t xml:space="preserve">Crea el commit, pushea el branch y abre (o actualiza) el PR con gh. Si hay ticket de ClickUp: actualiza el estado.</w:t>
+              <w:t xml:space="preserve">Genera el reporte de cierre formal: verifica cada etapa del flujo SpecBoot (propose, apply, security review, verify, QA, archive, sync, commit), asigna PASS / FAIL / NO EJECUTADO a cada una y determina el veredicto final. Sin este reporte el ticket no queda formalmente cerrado.</w:t>
             </w:r>
           </w:p>
         </w:tc>
@@ -3800,7 +3988,7 @@
                 <w:sz w:val="20"/>
                 <w:szCs w:val="20"/>
               </w:rPr>
-              <w:t xml:space="preserve">📁 Repo: commit en el branch remoto</w:t>
+              <w:t xml:space="preserve">📁 Repo: openspec/changes/&lt;TICKET-ID&gt;/reports/YYYY-MM-DD-closure-report.md</w:t>
             </w:r>
           </w:p>
           <w:p>
@@ -3810,17 +3998,7 @@
                 <w:sz w:val="20"/>
                 <w:szCs w:val="20"/>
               </w:rPr>
-              <w:t xml:space="preserve">🔗 GitHub: PR abierto</w:t>
-            </w:r>
-          </w:p>
-          <w:p>
-            <w:r>
-              <w:rPr>
-                <w:rFonts w:ascii="Arial" w:cs="Arial" w:eastAsia="Arial" w:hAnsi="Arial"/>
-                <w:sz w:val="20"/>
-                <w:szCs w:val="20"/>
-              </w:rPr>
-              <w:t xml:space="preserve">🔗 ClickUp: estado a En progreso + URL del PR</w:t>
+              <w:t xml:space="preserve">🔗 ClickUp: comentario de cierre con tabla de etapas + estado cambiado a Cerrado</w:t>
             </w:r>
           </w:p>
         </w:tc>

</xml_diff>